<commit_message>
Sync docx with markdown edits for RamonLlull outreach doc
Broadened funding language and expanded collaboration scope to match
the .md version.

Co-Authored-By: Claude Opus 4.6 <noreply@anthropic.com>
</commit_message>
<xml_diff>
--- a/05-Communications/Partner-Outreach/2026-03-14_Hitchhikers_RamonLlull.docx
+++ b/05-Communications/Partner-Outreach/2026-03-14_Hitchhikers_RamonLlull.docx
@@ -520,7 +520,7 @@
           <w:sz w:val="22"/>
           <w:szCs w:val="22"/>
         </w:rPr>
-        <w:t xml:space="preserve">We anticipate that funding for this work will come through Heather’s institutional relationships — at Oxford and associated institutions — rather than through open competitive calls. We are not pursuing generic grant frameworks. The intention is to work within networks of trust that already exist, and to let the funding follow the relationships rather than the other way around.</w:t>
+        <w:t>We anticipate that funding for this work will come through existing personal and institutional relationships — at Oxford and other American and European institutions — rather than through open competitive calls. We are not pursuing generic grant frameworks. The intention is to work within networks of trust that already exist, and to let the funding follow the relationships rather than the other way around.</w:t>
       </w:r>
     </w:p>
     <w:p>
@@ -818,7 +818,7 @@
           <w:sz w:val="22"/>
           <w:szCs w:val="22"/>
         </w:rPr>
-        <w:t xml:space="preserve">Any student wishing to collaborate formally with the Hitchhiker’s Guide to Earth project would be invited to co-author a brief working agreement at the outset — covering scope, expected outputs, time commitment, and attribution. This is not a contract, but a shared document of intent, revisable by either party. It reflects the project’s broader philosophy: that good collaboration begins with honest conversation about what each person needs and can offer.</w:t>
+        <w:t>Any professor, class, or student wishing to collaborate formally with the Hitchhiker’s Guide to Earth project would be invited to co-author a brief working agreement at the outset — covering scope, expected outputs, time commitment, and attribution. This is not a contract, but a shared document of intent, revisable by either party and subject to ongoing mutual consent. It reflects the project’s broader philosophy: that good collaboration begins with honest conversation about what each person needs and can offer.</w:t>
       </w:r>
     </w:p>
     <w:p>

</xml_diff>